<commit_message>
Section 5 de TAB_slides + corrections mineures outils et POO_slides
</commit_message>
<xml_diff>
--- a/enonces/TAB_enonces.docx
+++ b/enonces/TAB_enonces.docx
@@ -3673,7 +3673,7 @@
                 <w:sz w:val="22"/>
                 <w:szCs w:val="22"/>
               </w:rPr>
-              <w:t xml:space="preserve">Un Vendor possède une Person : c'est un champ, comme un autre. On serait tenté d'écrire qu'un vendeur EST une personne, ce qui se traduirait par de l'héritage — mais ce n'est pas le sujet de cette séance, et la distinction entre « a un » et « est un » mérite mieux qu'une note de bas de page.</w:t>
+              <w:t xml:space="preserve">Un Vendor possède une Person : c'est un champ, comme un autre. Le vendeur est vu ici comme un rôle que joue une personne. On aurait pu écrire, tout aussi légitimement, qu'un vendeur EST une personne : c'est l'héritage, que vous connaissez par le C#. Les deux modèles se défendent ; celui-ci permettrait à la même personne de jouer d'autres rôles, d'être cliente par exemple, sans changer de classe.</w:t>
             </w:r>
           </w:p>
           <w:p>
@@ -3685,7 +3685,7 @@
                 <w:sz w:val="22"/>
                 <w:szCs w:val="22"/>
               </w:rPr>
-              <w:t xml:space="preserve">Vous y viendrez au thème ABS, et vous pourrez alors reprendre cet exercice pour en discuter.</w:t>
+              <w:t xml:space="preserve">Le thème ABS compare les deux approches sur cet exemple.</w:t>
             </w:r>
           </w:p>
         </w:tc>

</xml_diff>